<commit_message>
Corregido ciclo 2 y 4, al igual que el Stack de objetos reestructurado.
</commit_message>
<xml_diff>
--- a/Retrospectiva proyecto inicial.docx
+++ b/Retrospectiva proyecto inicial.docx
@@ -1,6 +1,6 @@
 
 <file path=word/document.xml><?xml version="1.0" encoding="utf-8"?>
-<w:document xmlns:wpc="http://schemas.microsoft.com/office/word/2010/wordprocessingCanvas" xmlns:cx="http://schemas.microsoft.com/office/drawing/2014/chartex" xmlns:cx1="http://schemas.microsoft.com/office/drawing/2015/9/8/chartex" xmlns:cx2="http://schemas.microsoft.com/office/drawing/2015/10/21/chartex" xmlns:cx3="http://schemas.microsoft.com/office/drawing/2016/5/9/chartex" xmlns:cx4="http://schemas.microsoft.com/office/drawing/2016/5/10/chartex" xmlns:cx5="http://schemas.microsoft.com/office/drawing/2016/5/11/chartex" xmlns:cx6="http://schemas.microsoft.com/office/drawing/2016/5/12/chartex" xmlns:cx7="http://schemas.microsoft.com/office/drawing/2016/5/13/chartex" xmlns:cx8="http://schemas.microsoft.com/office/drawing/2016/5/14/chartex" xmlns:mc="http://schemas.openxmlformats.org/markup-compatibility/2006" xmlns:aink="http://schemas.microsoft.com/office/drawing/2016/ink" xmlns:am3d="http://schemas.microsoft.com/office/drawing/2017/model3d" xmlns:o="urn:schemas-microsoft-com:office:office" xmlns:r="http://schemas.openxmlformats.org/officeDocument/2006/relationships" xmlns:m="http://schemas.openxmlformats.org/officeDocument/2006/math" xmlns:v="urn:schemas-microsoft-com:vml" xmlns:wp14="http://schemas.microsoft.com/office/word/2010/wordprocessingDrawing" xmlns:wp="http://schemas.openxmlformats.org/drawingml/2006/wordprocessingDrawing" xmlns:w10="urn:schemas-microsoft-com:office:word" xmlns:w="http://schemas.openxmlformats.org/wordprocessingml/2006/main" xmlns:w14="http://schemas.microsoft.com/office/word/2010/wordml" xmlns:w15="http://schemas.microsoft.com/office/word/2012/wordml" xmlns:w16cex="http://schemas.microsoft.com/office/word/2018/wordml/cex" xmlns:w16cid="http://schemas.microsoft.com/office/word/2016/wordml/cid" xmlns:w16="http://schemas.microsoft.com/office/word/2018/wordml" xmlns:w16sdtdh="http://schemas.microsoft.com/office/word/2020/wordml/sdtdatahash" xmlns:w16se="http://schemas.microsoft.com/office/word/2015/wordml/symex" xmlns:wpg="http://schemas.microsoft.com/office/word/2010/wordprocessingGroup" xmlns:wpi="http://schemas.microsoft.com/office/word/2010/wordprocessingInk" xmlns:wne="http://schemas.microsoft.com/office/word/2006/wordml" xmlns:wps="http://schemas.microsoft.com/office/word/2010/wordprocessingShape" mc:Ignorable="w14 w15 w16se w16cid w16 w16cex w16sdtdh wp14">
+<w:document xmlns:wpc="http://schemas.microsoft.com/office/word/2010/wordprocessingCanvas" xmlns:cx="http://schemas.microsoft.com/office/drawing/2014/chartex" xmlns:cx1="http://schemas.microsoft.com/office/drawing/2015/9/8/chartex" xmlns:cx2="http://schemas.microsoft.com/office/drawing/2015/10/21/chartex" xmlns:cx3="http://schemas.microsoft.com/office/drawing/2016/5/9/chartex" xmlns:cx4="http://schemas.microsoft.com/office/drawing/2016/5/10/chartex" xmlns:cx5="http://schemas.microsoft.com/office/drawing/2016/5/11/chartex" xmlns:cx6="http://schemas.microsoft.com/office/drawing/2016/5/12/chartex" xmlns:cx7="http://schemas.microsoft.com/office/drawing/2016/5/13/chartex" xmlns:cx8="http://schemas.microsoft.com/office/drawing/2016/5/14/chartex" xmlns:mc="http://schemas.openxmlformats.org/markup-compatibility/2006" xmlns:aink="http://schemas.microsoft.com/office/drawing/2016/ink" xmlns:am3d="http://schemas.microsoft.com/office/drawing/2017/model3d" xmlns:o="urn:schemas-microsoft-com:office:office" xmlns:oel="http://schemas.microsoft.com/office/2019/extlst" xmlns:r="http://schemas.openxmlformats.org/officeDocument/2006/relationships" xmlns:m="http://schemas.openxmlformats.org/officeDocument/2006/math" xmlns:v="urn:schemas-microsoft-com:vml" xmlns:wp14="http://schemas.microsoft.com/office/word/2010/wordprocessingDrawing" xmlns:wp="http://schemas.openxmlformats.org/drawingml/2006/wordprocessingDrawing" xmlns:w10="urn:schemas-microsoft-com:office:word" xmlns:w="http://schemas.openxmlformats.org/wordprocessingml/2006/main" xmlns:w14="http://schemas.microsoft.com/office/word/2010/wordml" xmlns:w15="http://schemas.microsoft.com/office/word/2012/wordml" xmlns:w16cex="http://schemas.microsoft.com/office/word/2018/wordml/cex" xmlns:w16cid="http://schemas.microsoft.com/office/word/2016/wordml/cid" xmlns:w16="http://schemas.microsoft.com/office/word/2018/wordml" xmlns:w16du="http://schemas.microsoft.com/office/word/2023/wordml/word16du" xmlns:w16sdtdh="http://schemas.microsoft.com/office/word/2020/wordml/sdtdatahash" xmlns:w16sdtfl="http://schemas.microsoft.com/office/word/2024/wordml/sdtformatlock" xmlns:w16se="http://schemas.microsoft.com/office/word/2015/wordml/symex" xmlns:wpg="http://schemas.microsoft.com/office/word/2010/wordprocessingGroup" xmlns:wpi="http://schemas.microsoft.com/office/word/2010/wordprocessingInk" xmlns:wne="http://schemas.microsoft.com/office/word/2006/wordml" xmlns:wps="http://schemas.microsoft.com/office/word/2010/wordprocessingShape" mc:Ignorable="w14 w15 w16se w16cid w16 w16cex w16sdtdh w16sdtfl w16du wp14">
   <w:body>
     <w:p>
       <w:pPr>
@@ -137,14 +137,7 @@
           <w:sz w:val="20"/>
           <w:szCs w:val="20"/>
         </w:rPr>
-        <w:t xml:space="preserve">Elaboración de diagramas de secuencia. </w:t>
-      </w:r>
-      <w:r>
-        <w:rPr>
-          <w:sz w:val="20"/>
-          <w:szCs w:val="20"/>
-        </w:rPr>
-        <w:t>Definimos la interacción entre objetos</w:t>
+        <w:t>Elaboración de diagramas de secuencia. Definimos la interacción entre objetos</w:t>
       </w:r>
     </w:p>
     <w:p>
@@ -210,16 +203,7 @@
           <w:sz w:val="20"/>
           <w:szCs w:val="20"/>
         </w:rPr>
-        <w:t>2. ¿Cuál es el estado actual del proyecto en términos de mini-ciclos? ¿por qué</w:t>
-      </w:r>
-      <w:r>
-        <w:rPr>
-          <w:b/>
-          <w:bCs/>
-          <w:sz w:val="20"/>
-          <w:szCs w:val="20"/>
-        </w:rPr>
-        <w:t>?</w:t>
+        <w:t>2. ¿Cuál es el estado actual del proyecto en términos de mini-ciclos? ¿por qué?</w:t>
       </w:r>
     </w:p>
     <w:p>
@@ -269,16 +253,7 @@
           <w:sz w:val="20"/>
           <w:szCs w:val="20"/>
         </w:rPr>
-        <w:t>3. ¿Cuál fue el tiempo total</w:t>
-      </w:r>
-      <w:r>
-        <w:rPr>
-          <w:b/>
-          <w:bCs/>
-          <w:sz w:val="20"/>
-          <w:szCs w:val="20"/>
-        </w:rPr>
-        <w:t xml:space="preserve"> invertido por cada uno de ustedes? (Horas/nombre)</w:t>
+        <w:t>3. ¿Cuál fue el tiempo total invertido por cada uno de ustedes? (Horas/nombre)</w:t>
       </w:r>
     </w:p>
     <w:p>
@@ -395,16 +370,7 @@
           <w:sz w:val="20"/>
           <w:szCs w:val="20"/>
         </w:rPr>
-        <w:t xml:space="preserve">5. ¿Cuál consideran que fue el mayor problema técnico? ¿Qué hicieron </w:t>
-      </w:r>
-      <w:r>
-        <w:rPr>
-          <w:b/>
-          <w:bCs/>
-          <w:sz w:val="20"/>
-          <w:szCs w:val="20"/>
-        </w:rPr>
-        <w:t>para resolverlo?</w:t>
+        <w:t>5. ¿Cuál consideran que fue el mayor problema técnico? ¿Qué hicieron para resolverlo?</w:t>
       </w:r>
     </w:p>
     <w:p>
@@ -484,16 +450,7 @@
           <w:sz w:val="20"/>
           <w:szCs w:val="20"/>
         </w:rPr>
-        <w:t xml:space="preserve"> ¿Qué hicieron bien como equipo? ¿Qué se comprometen a hacer par</w:t>
-      </w:r>
-      <w:r>
-        <w:rPr>
-          <w:b/>
-          <w:bCs/>
-          <w:sz w:val="20"/>
-          <w:szCs w:val="20"/>
-        </w:rPr>
-        <w:t>a mejorar los resultados?</w:t>
+        <w:t xml:space="preserve"> ¿Qué hicieron bien como equipo? ¿Qué se comprometen a hacer para mejorar los resultados?</w:t>
       </w:r>
     </w:p>
     <w:p>
@@ -566,14 +523,7 @@
           <w:sz w:val="20"/>
           <w:szCs w:val="20"/>
         </w:rPr>
-        <w:t xml:space="preserve">La práctica más útil fue la refactorización continua, ya que en el desarrollo del diagrama pudimos </w:t>
-      </w:r>
-      <w:r>
-        <w:rPr>
-          <w:sz w:val="20"/>
-          <w:szCs w:val="20"/>
-        </w:rPr>
-        <w:t xml:space="preserve">observar </w:t>
+        <w:t xml:space="preserve">La práctica más útil fue la refactorización continua, ya que en el desarrollo del diagrama pudimos observar </w:t>
       </w:r>
       <w:r>
         <w:rPr>
@@ -653,14 +603,7 @@
           <w:sz w:val="20"/>
           <w:szCs w:val="20"/>
         </w:rPr>
-        <w:t>revisamos el documento de la maratón, nos ayudó a mejorar el planteamiento del simula</w:t>
-      </w:r>
-      <w:r>
-        <w:rPr>
-          <w:sz w:val="20"/>
-          <w:szCs w:val="20"/>
-        </w:rPr>
-        <w:t>dor</w:t>
+        <w:t>revisamos el documento de la maratón, nos ayudó a mejorar el planteamiento del simulador</w:t>
       </w:r>
     </w:p>
     <w:p>
@@ -1855,14 +1798,7 @@
           <w:sz w:val="20"/>
           <w:szCs w:val="20"/>
         </w:rPr>
-        <w:t>Hicimos las correcciones correspondientes</w:t>
-      </w:r>
-      <w:r>
-        <w:rPr>
-          <w:sz w:val="20"/>
-          <w:szCs w:val="20"/>
-        </w:rPr>
-        <w:t xml:space="preserve">, </w:t>
+        <w:t xml:space="preserve">Hicimos las correcciones correspondientes, </w:t>
       </w:r>
     </w:p>
     <w:p>
@@ -2015,14 +1951,7 @@
           <w:sz w:val="20"/>
           <w:szCs w:val="20"/>
         </w:rPr>
-        <w:t xml:space="preserve">s correcciones que se hicieron para la </w:t>
-      </w:r>
-      <w:r>
-        <w:rPr>
-          <w:sz w:val="20"/>
-          <w:szCs w:val="20"/>
-        </w:rPr>
-        <w:t>construcción de la torre</w:t>
+        <w:t>s correcciones que se hicieron para la construcción de la torre</w:t>
       </w:r>
     </w:p>
     <w:p>
@@ -2310,6 +2239,789 @@
         </w:rPr>
         <w:t xml:space="preserve"> y el api de java</w:t>
       </w:r>
+    </w:p>
+    <w:p>
+      <w:pPr>
+        <w:rPr>
+          <w:sz w:val="20"/>
+          <w:szCs w:val="20"/>
+        </w:rPr>
+      </w:pPr>
+    </w:p>
+    <w:p>
+      <w:pPr>
+        <w:rPr>
+          <w:sz w:val="20"/>
+          <w:szCs w:val="20"/>
+        </w:rPr>
+      </w:pPr>
+    </w:p>
+    <w:p>
+      <w:pPr>
+        <w:rPr>
+          <w:b/>
+          <w:bCs/>
+          <w:sz w:val="20"/>
+          <w:szCs w:val="20"/>
+        </w:rPr>
+      </w:pPr>
+      <w:r>
+        <w:rPr>
+          <w:b/>
+          <w:bCs/>
+          <w:sz w:val="20"/>
+          <w:szCs w:val="20"/>
+        </w:rPr>
+        <w:lastRenderedPageBreak/>
+        <w:t xml:space="preserve">Retrospectiva </w:t>
+      </w:r>
+      <w:r>
+        <w:rPr>
+          <w:b/>
+          <w:bCs/>
+          <w:sz w:val="20"/>
+          <w:szCs w:val="20"/>
+        </w:rPr>
+        <w:t xml:space="preserve">cuarta </w:t>
+      </w:r>
+      <w:r>
+        <w:rPr>
+          <w:b/>
+          <w:bCs/>
+          <w:sz w:val="20"/>
+          <w:szCs w:val="20"/>
+        </w:rPr>
+        <w:t>entrega</w:t>
+      </w:r>
+    </w:p>
+    <w:p>
+      <w:pPr>
+        <w:rPr>
+          <w:b/>
+          <w:bCs/>
+          <w:sz w:val="20"/>
+          <w:szCs w:val="20"/>
+        </w:rPr>
+      </w:pPr>
+    </w:p>
+    <w:p>
+      <w:pPr>
+        <w:rPr>
+          <w:b/>
+          <w:bCs/>
+          <w:sz w:val="20"/>
+          <w:szCs w:val="20"/>
+        </w:rPr>
+      </w:pPr>
+      <w:r>
+        <w:rPr>
+          <w:b/>
+          <w:bCs/>
+          <w:sz w:val="20"/>
+          <w:szCs w:val="20"/>
+        </w:rPr>
+        <w:t xml:space="preserve">1. ¿Cuáles fueron los </w:t>
+      </w:r>
+      <w:proofErr w:type="spellStart"/>
+      <w:r>
+        <w:rPr>
+          <w:b/>
+          <w:bCs/>
+          <w:sz w:val="20"/>
+          <w:szCs w:val="20"/>
+        </w:rPr>
+        <w:t>mini-ciclos</w:t>
+      </w:r>
+      <w:proofErr w:type="spellEnd"/>
+      <w:r>
+        <w:rPr>
+          <w:b/>
+          <w:bCs/>
+          <w:sz w:val="20"/>
+          <w:szCs w:val="20"/>
+        </w:rPr>
+        <w:t xml:space="preserve"> definidos? Justifícalos.</w:t>
+      </w:r>
+    </w:p>
+    <w:p>
+      <w:pPr>
+        <w:rPr>
+          <w:b/>
+          <w:bCs/>
+          <w:sz w:val="20"/>
+          <w:szCs w:val="20"/>
+        </w:rPr>
+      </w:pPr>
+    </w:p>
+    <w:p>
+      <w:pPr>
+        <w:rPr>
+          <w:sz w:val="20"/>
+          <w:szCs w:val="20"/>
+        </w:rPr>
+      </w:pPr>
+      <w:r>
+        <w:rPr>
+          <w:sz w:val="20"/>
+          <w:szCs w:val="20"/>
+        </w:rPr>
+        <w:t xml:space="preserve">Se definieron </w:t>
+      </w:r>
+      <w:r>
+        <w:rPr>
+          <w:sz w:val="20"/>
+          <w:szCs w:val="20"/>
+        </w:rPr>
+        <w:t>4</w:t>
+      </w:r>
+      <w:r>
+        <w:rPr>
+          <w:sz w:val="20"/>
+          <w:szCs w:val="20"/>
+        </w:rPr>
+        <w:t xml:space="preserve"> mini ciclos</w:t>
+      </w:r>
+    </w:p>
+    <w:p>
+      <w:pPr>
+        <w:rPr>
+          <w:sz w:val="20"/>
+          <w:szCs w:val="20"/>
+        </w:rPr>
+      </w:pPr>
+    </w:p>
+    <w:p>
+      <w:pPr>
+        <w:numPr>
+          <w:ilvl w:val="0"/>
+          <w:numId w:val="4"/>
+        </w:numPr>
+        <w:rPr>
+          <w:sz w:val="20"/>
+          <w:szCs w:val="20"/>
+        </w:rPr>
+      </w:pPr>
+      <w:r>
+        <w:rPr>
+          <w:sz w:val="20"/>
+          <w:szCs w:val="20"/>
+        </w:rPr>
+        <w:t>Corrección del ciclo 2</w:t>
+      </w:r>
+    </w:p>
+    <w:p>
+      <w:pPr>
+        <w:numPr>
+          <w:ilvl w:val="0"/>
+          <w:numId w:val="4"/>
+        </w:numPr>
+        <w:rPr>
+          <w:sz w:val="20"/>
+          <w:szCs w:val="20"/>
+        </w:rPr>
+      </w:pPr>
+      <w:r>
+        <w:rPr>
+          <w:sz w:val="20"/>
+          <w:szCs w:val="20"/>
+        </w:rPr>
+        <w:t>Implementación ciclo 4</w:t>
+      </w:r>
+    </w:p>
+    <w:p>
+      <w:pPr>
+        <w:numPr>
+          <w:ilvl w:val="0"/>
+          <w:numId w:val="4"/>
+        </w:numPr>
+        <w:rPr>
+          <w:sz w:val="20"/>
+          <w:szCs w:val="20"/>
+        </w:rPr>
+      </w:pPr>
+      <w:r>
+        <w:rPr>
+          <w:sz w:val="20"/>
+          <w:szCs w:val="20"/>
+        </w:rPr>
+        <w:t>Adición de paquetes</w:t>
+      </w:r>
+    </w:p>
+    <w:p>
+      <w:pPr>
+        <w:numPr>
+          <w:ilvl w:val="0"/>
+          <w:numId w:val="4"/>
+        </w:numPr>
+        <w:rPr>
+          <w:sz w:val="20"/>
+          <w:szCs w:val="20"/>
+        </w:rPr>
+      </w:pPr>
+      <w:r>
+        <w:rPr>
+          <w:sz w:val="20"/>
+          <w:szCs w:val="20"/>
+        </w:rPr>
+        <w:t>Integración y últimos arreglos para los ciclos</w:t>
+      </w:r>
+    </w:p>
+    <w:p>
+      <w:pPr>
+        <w:ind w:left="720"/>
+        <w:rPr>
+          <w:sz w:val="20"/>
+          <w:szCs w:val="20"/>
+        </w:rPr>
+      </w:pPr>
+    </w:p>
+    <w:p>
+      <w:pPr>
+        <w:rPr>
+          <w:b/>
+          <w:bCs/>
+          <w:sz w:val="20"/>
+          <w:szCs w:val="20"/>
+        </w:rPr>
+      </w:pPr>
+      <w:r>
+        <w:rPr>
+          <w:b/>
+          <w:bCs/>
+          <w:sz w:val="20"/>
+          <w:szCs w:val="20"/>
+        </w:rPr>
+        <w:t xml:space="preserve">2. ¿Cuál es el estado actual del proyecto en términos de </w:t>
+      </w:r>
+      <w:proofErr w:type="spellStart"/>
+      <w:r>
+        <w:rPr>
+          <w:b/>
+          <w:bCs/>
+          <w:sz w:val="20"/>
+          <w:szCs w:val="20"/>
+        </w:rPr>
+        <w:t>mini-ciclos</w:t>
+      </w:r>
+      <w:proofErr w:type="spellEnd"/>
+      <w:r>
+        <w:rPr>
+          <w:b/>
+          <w:bCs/>
+          <w:sz w:val="20"/>
+          <w:szCs w:val="20"/>
+        </w:rPr>
+        <w:t>? ¿por qué?</w:t>
+      </w:r>
+    </w:p>
+    <w:p>
+      <w:pPr>
+        <w:rPr>
+          <w:sz w:val="20"/>
+          <w:szCs w:val="20"/>
+        </w:rPr>
+      </w:pPr>
+    </w:p>
+    <w:p>
+      <w:pPr>
+        <w:rPr>
+          <w:sz w:val="20"/>
+          <w:szCs w:val="20"/>
+        </w:rPr>
+      </w:pPr>
+      <w:r>
+        <w:rPr>
+          <w:sz w:val="20"/>
+          <w:szCs w:val="20"/>
+        </w:rPr>
+        <w:t>Hicimos las correcciones correspondientes</w:t>
+      </w:r>
+      <w:r>
+        <w:rPr>
+          <w:sz w:val="20"/>
+          <w:szCs w:val="20"/>
+        </w:rPr>
+        <w:t xml:space="preserve"> al ciclo 2 e integramos el ciclo 4.</w:t>
+      </w:r>
+      <w:r>
+        <w:rPr>
+          <w:sz w:val="20"/>
+          <w:szCs w:val="20"/>
+        </w:rPr>
+        <w:t xml:space="preserve"> </w:t>
+      </w:r>
+    </w:p>
+    <w:p>
+      <w:pPr>
+        <w:rPr>
+          <w:sz w:val="20"/>
+          <w:szCs w:val="20"/>
+        </w:rPr>
+      </w:pPr>
+    </w:p>
+    <w:p>
+      <w:pPr>
+        <w:rPr>
+          <w:b/>
+          <w:bCs/>
+          <w:sz w:val="20"/>
+          <w:szCs w:val="20"/>
+        </w:rPr>
+      </w:pPr>
+      <w:r>
+        <w:rPr>
+          <w:b/>
+          <w:bCs/>
+          <w:sz w:val="20"/>
+          <w:szCs w:val="20"/>
+        </w:rPr>
+        <w:t>3. ¿Cuál fue el tiempo total invertido por cada uno de ustedes? (Horas/nombre)</w:t>
+      </w:r>
+    </w:p>
+    <w:p>
+      <w:pPr>
+        <w:rPr>
+          <w:sz w:val="20"/>
+          <w:szCs w:val="20"/>
+        </w:rPr>
+      </w:pPr>
+    </w:p>
+    <w:p>
+      <w:pPr>
+        <w:spacing w:line="360" w:lineRule="auto"/>
+        <w:rPr>
+          <w:sz w:val="20"/>
+          <w:szCs w:val="20"/>
+        </w:rPr>
+      </w:pPr>
+      <w:r>
+        <w:rPr>
+          <w:sz w:val="20"/>
+          <w:szCs w:val="20"/>
+        </w:rPr>
+        <w:t xml:space="preserve">Sebastián </w:t>
+      </w:r>
+      <w:r>
+        <w:rPr>
+          <w:sz w:val="20"/>
+          <w:szCs w:val="20"/>
+        </w:rPr>
+        <w:t>45</w:t>
+      </w:r>
+      <w:r>
+        <w:rPr>
+          <w:sz w:val="20"/>
+          <w:szCs w:val="20"/>
+        </w:rPr>
+        <w:t xml:space="preserve"> horas</w:t>
+      </w:r>
+    </w:p>
+    <w:p>
+      <w:pPr>
+        <w:rPr>
+          <w:sz w:val="20"/>
+          <w:szCs w:val="20"/>
+        </w:rPr>
+      </w:pPr>
+      <w:r>
+        <w:rPr>
+          <w:sz w:val="20"/>
+          <w:szCs w:val="20"/>
+        </w:rPr>
+        <w:t xml:space="preserve">Paula </w:t>
+      </w:r>
+      <w:r>
+        <w:rPr>
+          <w:sz w:val="20"/>
+          <w:szCs w:val="20"/>
+        </w:rPr>
+        <w:t>45</w:t>
+      </w:r>
+      <w:r>
+        <w:rPr>
+          <w:sz w:val="20"/>
+          <w:szCs w:val="20"/>
+        </w:rPr>
+        <w:t xml:space="preserve"> </w:t>
+      </w:r>
+      <w:r>
+        <w:rPr>
+          <w:sz w:val="20"/>
+          <w:szCs w:val="20"/>
+        </w:rPr>
+        <w:t>horas</w:t>
+      </w:r>
+    </w:p>
+    <w:p>
+      <w:pPr>
+        <w:rPr>
+          <w:sz w:val="20"/>
+          <w:szCs w:val="20"/>
+        </w:rPr>
+      </w:pPr>
+    </w:p>
+    <w:p>
+      <w:pPr>
+        <w:rPr>
+          <w:b/>
+          <w:bCs/>
+          <w:sz w:val="20"/>
+          <w:szCs w:val="20"/>
+        </w:rPr>
+      </w:pPr>
+      <w:r>
+        <w:rPr>
+          <w:b/>
+          <w:bCs/>
+          <w:sz w:val="20"/>
+          <w:szCs w:val="20"/>
+        </w:rPr>
+        <w:t>4. ¿Cuál consideran fue el mayor logro? ¿Por qué?</w:t>
+      </w:r>
+    </w:p>
+    <w:p>
+      <w:pPr>
+        <w:rPr>
+          <w:b/>
+          <w:bCs/>
+          <w:sz w:val="20"/>
+          <w:szCs w:val="20"/>
+        </w:rPr>
+      </w:pPr>
+    </w:p>
+    <w:p>
+      <w:pPr>
+        <w:rPr>
+          <w:sz w:val="20"/>
+          <w:szCs w:val="20"/>
+        </w:rPr>
+      </w:pPr>
+      <w:r>
+        <w:rPr>
+          <w:sz w:val="20"/>
+          <w:szCs w:val="20"/>
+        </w:rPr>
+        <w:t>La</w:t>
+      </w:r>
+      <w:r>
+        <w:rPr>
+          <w:sz w:val="20"/>
+          <w:szCs w:val="20"/>
+        </w:rPr>
+        <w:t>s correcciones que se hicieron para la construcción de la torre</w:t>
+      </w:r>
+      <w:r>
+        <w:rPr>
+          <w:sz w:val="20"/>
+          <w:szCs w:val="20"/>
+        </w:rPr>
+        <w:t xml:space="preserve">, al igual que para el ciclo 2 los métodos e </w:t>
+      </w:r>
+      <w:proofErr w:type="spellStart"/>
+      <w:r>
+        <w:rPr>
+          <w:sz w:val="20"/>
+          <w:szCs w:val="20"/>
+        </w:rPr>
+        <w:t>integracion</w:t>
+      </w:r>
+      <w:proofErr w:type="spellEnd"/>
+      <w:r>
+        <w:rPr>
+          <w:sz w:val="20"/>
+          <w:szCs w:val="20"/>
+        </w:rPr>
+        <w:t xml:space="preserve"> de los nuevos tipos de objetos.</w:t>
+      </w:r>
+    </w:p>
+    <w:p>
+      <w:pPr>
+        <w:rPr>
+          <w:sz w:val="20"/>
+          <w:szCs w:val="20"/>
+        </w:rPr>
+      </w:pPr>
+    </w:p>
+    <w:p>
+      <w:pPr>
+        <w:rPr>
+          <w:b/>
+          <w:bCs/>
+          <w:sz w:val="20"/>
+          <w:szCs w:val="20"/>
+        </w:rPr>
+      </w:pPr>
+      <w:r>
+        <w:rPr>
+          <w:b/>
+          <w:bCs/>
+          <w:sz w:val="20"/>
+          <w:szCs w:val="20"/>
+        </w:rPr>
+        <w:t>5. ¿Cuál consideran que fue el mayor problema técnico? ¿Qué hicieron para resolverlo?</w:t>
+      </w:r>
+    </w:p>
+    <w:p>
+      <w:pPr>
+        <w:pBdr>
+          <w:top w:val="nil"/>
+          <w:left w:val="nil"/>
+          <w:bottom w:val="nil"/>
+          <w:right w:val="nil"/>
+          <w:between w:val="nil"/>
+        </w:pBdr>
+        <w:rPr>
+          <w:sz w:val="20"/>
+          <w:szCs w:val="20"/>
+        </w:rPr>
+      </w:pPr>
+    </w:p>
+    <w:p>
+      <w:pPr>
+        <w:pBdr>
+          <w:top w:val="nil"/>
+          <w:left w:val="nil"/>
+          <w:bottom w:val="nil"/>
+          <w:right w:val="nil"/>
+          <w:between w:val="nil"/>
+        </w:pBdr>
+        <w:rPr>
+          <w:sz w:val="20"/>
+          <w:szCs w:val="20"/>
+        </w:rPr>
+      </w:pPr>
+      <w:r>
+        <w:rPr>
+          <w:sz w:val="20"/>
+          <w:szCs w:val="20"/>
+        </w:rPr>
+        <w:t xml:space="preserve">El mayor problema técnico </w:t>
+      </w:r>
+      <w:r>
+        <w:rPr>
+          <w:sz w:val="20"/>
+          <w:szCs w:val="20"/>
+        </w:rPr>
+        <w:t>fue refactorizar el código para evitar escribir varias veces lo mismo</w:t>
+      </w:r>
+      <w:r>
+        <w:rPr>
+          <w:sz w:val="20"/>
+          <w:szCs w:val="20"/>
+        </w:rPr>
+        <w:t xml:space="preserve">, además de ver como organizar parte del ciclo 1 para que </w:t>
+      </w:r>
+      <w:proofErr w:type="spellStart"/>
+      <w:r>
+        <w:rPr>
+          <w:sz w:val="20"/>
+          <w:szCs w:val="20"/>
+        </w:rPr>
+        <w:t>funcionacen</w:t>
+      </w:r>
+      <w:proofErr w:type="spellEnd"/>
+      <w:r>
+        <w:rPr>
+          <w:sz w:val="20"/>
+          <w:szCs w:val="20"/>
+        </w:rPr>
+        <w:t xml:space="preserve"> los tipos del ciclo 4.</w:t>
+      </w:r>
+    </w:p>
+    <w:p>
+      <w:pPr>
+        <w:pBdr>
+          <w:top w:val="nil"/>
+          <w:left w:val="nil"/>
+          <w:bottom w:val="nil"/>
+          <w:right w:val="nil"/>
+          <w:between w:val="nil"/>
+        </w:pBdr>
+        <w:rPr>
+          <w:sz w:val="20"/>
+          <w:szCs w:val="20"/>
+        </w:rPr>
+      </w:pPr>
+    </w:p>
+    <w:p>
+      <w:pPr>
+        <w:rPr>
+          <w:b/>
+          <w:bCs/>
+          <w:sz w:val="20"/>
+          <w:szCs w:val="20"/>
+        </w:rPr>
+      </w:pPr>
+      <w:r>
+        <w:rPr>
+          <w:b/>
+          <w:bCs/>
+          <w:sz w:val="20"/>
+          <w:szCs w:val="20"/>
+        </w:rPr>
+        <w:t>6. ¿Qué hicieron bien como equipo? ¿Qué se comprometen a hacer para mejorar los resultados?</w:t>
+      </w:r>
+    </w:p>
+    <w:p>
+      <w:pPr>
+        <w:rPr>
+          <w:sz w:val="20"/>
+          <w:szCs w:val="20"/>
+        </w:rPr>
+      </w:pPr>
+    </w:p>
+    <w:p>
+      <w:pPr>
+        <w:rPr>
+          <w:sz w:val="20"/>
+          <w:szCs w:val="20"/>
+        </w:rPr>
+      </w:pPr>
+      <w:r>
+        <w:rPr>
+          <w:sz w:val="20"/>
+          <w:szCs w:val="20"/>
+        </w:rPr>
+        <w:t>El trabajo en equipo fue bueno</w:t>
+      </w:r>
+      <w:r>
+        <w:rPr>
+          <w:sz w:val="20"/>
+          <w:szCs w:val="20"/>
+        </w:rPr>
+        <w:t xml:space="preserve">, las ideas para el desarrollo del código se complementaban, nos comprometemos </w:t>
+      </w:r>
+      <w:r>
+        <w:rPr>
+          <w:sz w:val="20"/>
+          <w:szCs w:val="20"/>
+        </w:rPr>
+        <w:t>a observar bien las fallas e implementar en completo lo que nos falte en las entregas, como requisitos.</w:t>
+      </w:r>
+    </w:p>
+    <w:p>
+      <w:pPr>
+        <w:rPr>
+          <w:sz w:val="20"/>
+          <w:szCs w:val="20"/>
+        </w:rPr>
+      </w:pPr>
+    </w:p>
+    <w:p>
+      <w:pPr>
+        <w:rPr>
+          <w:b/>
+          <w:bCs/>
+          <w:sz w:val="20"/>
+          <w:szCs w:val="20"/>
+        </w:rPr>
+      </w:pPr>
+      <w:r>
+        <w:rPr>
+          <w:b/>
+          <w:bCs/>
+          <w:sz w:val="20"/>
+          <w:szCs w:val="20"/>
+        </w:rPr>
+        <w:t>7. Considerando las prácticas XP incluidas en los laboratorios. ¿cuál fue la más útil? ¿por qué?</w:t>
+      </w:r>
+    </w:p>
+    <w:p>
+      <w:pPr>
+        <w:rPr>
+          <w:sz w:val="20"/>
+          <w:szCs w:val="20"/>
+        </w:rPr>
+      </w:pPr>
+    </w:p>
+    <w:p>
+      <w:pPr>
+        <w:rPr>
+          <w:sz w:val="20"/>
+          <w:szCs w:val="20"/>
+        </w:rPr>
+      </w:pPr>
+      <w:r>
+        <w:rPr>
+          <w:sz w:val="20"/>
+          <w:szCs w:val="20"/>
+        </w:rPr>
+        <w:t>La práctica más útil fue la refactorización continua, ya que en el desarrollo del diagrama pudimos observar cómo se podían simplificar algunas cosas para mejorar la estructura</w:t>
+      </w:r>
+      <w:r>
+        <w:rPr>
+          <w:sz w:val="20"/>
+          <w:szCs w:val="20"/>
+        </w:rPr>
+        <w:t>.</w:t>
+      </w:r>
+    </w:p>
+    <w:p>
+      <w:pPr>
+        <w:rPr>
+          <w:b/>
+          <w:bCs/>
+          <w:sz w:val="20"/>
+          <w:szCs w:val="20"/>
+        </w:rPr>
+      </w:pPr>
+    </w:p>
+    <w:p>
+      <w:pPr>
+        <w:rPr>
+          <w:b/>
+          <w:bCs/>
+          <w:sz w:val="20"/>
+          <w:szCs w:val="20"/>
+        </w:rPr>
+      </w:pPr>
+      <w:r>
+        <w:rPr>
+          <w:b/>
+          <w:bCs/>
+          <w:sz w:val="20"/>
+          <w:szCs w:val="20"/>
+        </w:rPr>
+        <w:t>8. ¿Qué referencias usaron? ¿Cuál fue la más útil? Incluyan citas con estándares adecuados.</w:t>
+      </w:r>
+    </w:p>
+    <w:p>
+      <w:pPr>
+        <w:rPr>
+          <w:sz w:val="20"/>
+          <w:szCs w:val="20"/>
+        </w:rPr>
+      </w:pPr>
+    </w:p>
+    <w:p>
+      <w:pPr>
+        <w:rPr>
+          <w:sz w:val="20"/>
+          <w:szCs w:val="20"/>
+        </w:rPr>
+      </w:pPr>
+      <w:r>
+        <w:rPr>
+          <w:sz w:val="20"/>
+          <w:szCs w:val="20"/>
+        </w:rPr>
+        <w:t>revisamos el documento de la maratón</w:t>
+      </w:r>
+      <w:r>
+        <w:rPr>
+          <w:sz w:val="20"/>
+          <w:szCs w:val="20"/>
+        </w:rPr>
+        <w:t xml:space="preserve"> y el api de java</w:t>
+      </w:r>
+    </w:p>
+    <w:p>
+      <w:pPr>
+        <w:rPr>
+          <w:sz w:val="20"/>
+          <w:szCs w:val="20"/>
+        </w:rPr>
+      </w:pPr>
     </w:p>
     <w:p>
       <w:pPr>
@@ -2330,9 +3042,9 @@
 </file>
 
 <file path=word/numbering.xml><?xml version="1.0" encoding="utf-8"?>
-<w:numbering xmlns:wpc="http://schemas.microsoft.com/office/word/2010/wordprocessingCanvas" xmlns:cx="http://schemas.microsoft.com/office/drawing/2014/chartex" xmlns:cx1="http://schemas.microsoft.com/office/drawing/2015/9/8/chartex" xmlns:cx2="http://schemas.microsoft.com/office/drawing/2015/10/21/chartex" xmlns:cx3="http://schemas.microsoft.com/office/drawing/2016/5/9/chartex" xmlns:cx4="http://schemas.microsoft.com/office/drawing/2016/5/10/chartex" xmlns:cx5="http://schemas.microsoft.com/office/drawing/2016/5/11/chartex" xmlns:cx6="http://schemas.microsoft.com/office/drawing/2016/5/12/chartex" xmlns:cx7="http://schemas.microsoft.com/office/drawing/2016/5/13/chartex" xmlns:cx8="http://schemas.microsoft.com/office/drawing/2016/5/14/chartex" xmlns:mc="http://schemas.openxmlformats.org/markup-compatibility/2006" xmlns:aink="http://schemas.microsoft.com/office/drawing/2016/ink" xmlns:am3d="http://schemas.microsoft.com/office/drawing/2017/model3d" xmlns:o="urn:schemas-microsoft-com:office:office" xmlns:r="http://schemas.openxmlformats.org/officeDocument/2006/relationships" xmlns:m="http://schemas.openxmlformats.org/officeDocument/2006/math" xmlns:v="urn:schemas-microsoft-com:vml" xmlns:wp14="http://schemas.microsoft.com/office/word/2010/wordprocessingDrawing" xmlns:wp="http://schemas.openxmlformats.org/drawingml/2006/wordprocessingDrawing" xmlns:w10="urn:schemas-microsoft-com:office:word" xmlns:w="http://schemas.openxmlformats.org/wordprocessingml/2006/main" xmlns:w14="http://schemas.microsoft.com/office/word/2010/wordml" xmlns:w15="http://schemas.microsoft.com/office/word/2012/wordml" xmlns:w16cex="http://schemas.microsoft.com/office/word/2018/wordml/cex" xmlns:w16cid="http://schemas.microsoft.com/office/word/2016/wordml/cid" xmlns:w16="http://schemas.microsoft.com/office/word/2018/wordml" xmlns:w16sdtdh="http://schemas.microsoft.com/office/word/2020/wordml/sdtdatahash" xmlns:w16se="http://schemas.microsoft.com/office/word/2015/wordml/symex" xmlns:wpg="http://schemas.microsoft.com/office/word/2010/wordprocessingGroup" xmlns:wpi="http://schemas.microsoft.com/office/word/2010/wordprocessingInk" xmlns:wne="http://schemas.microsoft.com/office/word/2006/wordml" xmlns:wps="http://schemas.microsoft.com/office/word/2010/wordprocessingShape" mc:Ignorable="w14 w15 w16se w16cid w16 w16cex w16sdtdh wp14">
+<w:numbering xmlns:wpc="http://schemas.microsoft.com/office/word/2010/wordprocessingCanvas" xmlns:cx="http://schemas.microsoft.com/office/drawing/2014/chartex" xmlns:cx1="http://schemas.microsoft.com/office/drawing/2015/9/8/chartex" xmlns:cx2="http://schemas.microsoft.com/office/drawing/2015/10/21/chartex" xmlns:cx3="http://schemas.microsoft.com/office/drawing/2016/5/9/chartex" xmlns:cx4="http://schemas.microsoft.com/office/drawing/2016/5/10/chartex" xmlns:cx5="http://schemas.microsoft.com/office/drawing/2016/5/11/chartex" xmlns:cx6="http://schemas.microsoft.com/office/drawing/2016/5/12/chartex" xmlns:cx7="http://schemas.microsoft.com/office/drawing/2016/5/13/chartex" xmlns:cx8="http://schemas.microsoft.com/office/drawing/2016/5/14/chartex" xmlns:mc="http://schemas.openxmlformats.org/markup-compatibility/2006" xmlns:aink="http://schemas.microsoft.com/office/drawing/2016/ink" xmlns:am3d="http://schemas.microsoft.com/office/drawing/2017/model3d" xmlns:o="urn:schemas-microsoft-com:office:office" xmlns:oel="http://schemas.microsoft.com/office/2019/extlst" xmlns:r="http://schemas.openxmlformats.org/officeDocument/2006/relationships" xmlns:m="http://schemas.openxmlformats.org/officeDocument/2006/math" xmlns:v="urn:schemas-microsoft-com:vml" xmlns:wp14="http://schemas.microsoft.com/office/word/2010/wordprocessingDrawing" xmlns:wp="http://schemas.openxmlformats.org/drawingml/2006/wordprocessingDrawing" xmlns:w10="urn:schemas-microsoft-com:office:word" xmlns:w="http://schemas.openxmlformats.org/wordprocessingml/2006/main" xmlns:w14="http://schemas.microsoft.com/office/word/2010/wordml" xmlns:w15="http://schemas.microsoft.com/office/word/2012/wordml" xmlns:w16cex="http://schemas.microsoft.com/office/word/2018/wordml/cex" xmlns:w16cid="http://schemas.microsoft.com/office/word/2016/wordml/cid" xmlns:w16="http://schemas.microsoft.com/office/word/2018/wordml" xmlns:w16du="http://schemas.microsoft.com/office/word/2023/wordml/word16du" xmlns:w16sdtdh="http://schemas.microsoft.com/office/word/2020/wordml/sdtdatahash" xmlns:w16sdtfl="http://schemas.microsoft.com/office/word/2024/wordml/sdtformatlock" xmlns:w16se="http://schemas.microsoft.com/office/word/2015/wordml/symex" xmlns:wpg="http://schemas.microsoft.com/office/word/2010/wordprocessingGroup" xmlns:wpi="http://schemas.microsoft.com/office/word/2010/wordprocessingInk" xmlns:wne="http://schemas.microsoft.com/office/word/2006/wordml" xmlns:wps="http://schemas.microsoft.com/office/word/2010/wordprocessingShape" mc:Ignorable="w14 w15 w16se w16cid w16 w16cex w16sdtdh w16sdtfl w16du wp14">
   <w:abstractNum w:abstractNumId="0" w15:restartNumberingAfterBreak="0">
-    <w:nsid w:val="48D25382"/>
+    <w:nsid w:val="30D5150D"/>
     <w:multiLevelType w:val="multilevel"/>
     <w:tmpl w:val="759EB756"/>
     <w:lvl w:ilvl="0">
@@ -2445,7 +3157,7 @@
     </w:lvl>
   </w:abstractNum>
   <w:abstractNum w:abstractNumId="1" w15:restartNumberingAfterBreak="0">
-    <w:nsid w:val="4B942574"/>
+    <w:nsid w:val="48D25382"/>
     <w:multiLevelType w:val="multilevel"/>
     <w:tmpl w:val="759EB756"/>
     <w:lvl w:ilvl="0">
@@ -2558,7 +3270,7 @@
     </w:lvl>
   </w:abstractNum>
   <w:abstractNum w:abstractNumId="2" w15:restartNumberingAfterBreak="0">
-    <w:nsid w:val="53D97C47"/>
+    <w:nsid w:val="4B942574"/>
     <w:multiLevelType w:val="multilevel"/>
     <w:tmpl w:val="759EB756"/>
     <w:lvl w:ilvl="0">
@@ -2670,20 +3382,136 @@
       </w:rPr>
     </w:lvl>
   </w:abstractNum>
-  <w:num w:numId="1">
+  <w:abstractNum w:abstractNumId="3" w15:restartNumberingAfterBreak="0">
+    <w:nsid w:val="53D97C47"/>
+    <w:multiLevelType w:val="multilevel"/>
+    <w:tmpl w:val="759EB756"/>
+    <w:lvl w:ilvl="0">
+      <w:start w:val="1"/>
+      <w:numFmt w:val="decimal"/>
+      <w:lvlText w:val="%1."/>
+      <w:lvlJc w:val="left"/>
+      <w:pPr>
+        <w:ind w:left="720" w:hanging="360"/>
+      </w:pPr>
+      <w:rPr>
+        <w:u w:val="none"/>
+      </w:rPr>
+    </w:lvl>
+    <w:lvl w:ilvl="1">
+      <w:start w:val="1"/>
+      <w:numFmt w:val="lowerLetter"/>
+      <w:lvlText w:val="%2."/>
+      <w:lvlJc w:val="left"/>
+      <w:pPr>
+        <w:ind w:left="1440" w:hanging="360"/>
+      </w:pPr>
+      <w:rPr>
+        <w:u w:val="none"/>
+      </w:rPr>
+    </w:lvl>
+    <w:lvl w:ilvl="2">
+      <w:start w:val="1"/>
+      <w:numFmt w:val="lowerRoman"/>
+      <w:lvlText w:val="%3."/>
+      <w:lvlJc w:val="right"/>
+      <w:pPr>
+        <w:ind w:left="2160" w:hanging="360"/>
+      </w:pPr>
+      <w:rPr>
+        <w:u w:val="none"/>
+      </w:rPr>
+    </w:lvl>
+    <w:lvl w:ilvl="3">
+      <w:start w:val="1"/>
+      <w:numFmt w:val="decimal"/>
+      <w:lvlText w:val="%4."/>
+      <w:lvlJc w:val="left"/>
+      <w:pPr>
+        <w:ind w:left="2880" w:hanging="360"/>
+      </w:pPr>
+      <w:rPr>
+        <w:u w:val="none"/>
+      </w:rPr>
+    </w:lvl>
+    <w:lvl w:ilvl="4">
+      <w:start w:val="1"/>
+      <w:numFmt w:val="lowerLetter"/>
+      <w:lvlText w:val="%5."/>
+      <w:lvlJc w:val="left"/>
+      <w:pPr>
+        <w:ind w:left="3600" w:hanging="360"/>
+      </w:pPr>
+      <w:rPr>
+        <w:u w:val="none"/>
+      </w:rPr>
+    </w:lvl>
+    <w:lvl w:ilvl="5">
+      <w:start w:val="1"/>
+      <w:numFmt w:val="lowerRoman"/>
+      <w:lvlText w:val="%6."/>
+      <w:lvlJc w:val="right"/>
+      <w:pPr>
+        <w:ind w:left="4320" w:hanging="360"/>
+      </w:pPr>
+      <w:rPr>
+        <w:u w:val="none"/>
+      </w:rPr>
+    </w:lvl>
+    <w:lvl w:ilvl="6">
+      <w:start w:val="1"/>
+      <w:numFmt w:val="decimal"/>
+      <w:lvlText w:val="%7."/>
+      <w:lvlJc w:val="left"/>
+      <w:pPr>
+        <w:ind w:left="5040" w:hanging="360"/>
+      </w:pPr>
+      <w:rPr>
+        <w:u w:val="none"/>
+      </w:rPr>
+    </w:lvl>
+    <w:lvl w:ilvl="7">
+      <w:start w:val="1"/>
+      <w:numFmt w:val="lowerLetter"/>
+      <w:lvlText w:val="%8."/>
+      <w:lvlJc w:val="left"/>
+      <w:pPr>
+        <w:ind w:left="5760" w:hanging="360"/>
+      </w:pPr>
+      <w:rPr>
+        <w:u w:val="none"/>
+      </w:rPr>
+    </w:lvl>
+    <w:lvl w:ilvl="8">
+      <w:start w:val="1"/>
+      <w:numFmt w:val="lowerRoman"/>
+      <w:lvlText w:val="%9."/>
+      <w:lvlJc w:val="right"/>
+      <w:pPr>
+        <w:ind w:left="6480" w:hanging="360"/>
+      </w:pPr>
+      <w:rPr>
+        <w:u w:val="none"/>
+      </w:rPr>
+    </w:lvl>
+  </w:abstractNum>
+  <w:num w:numId="1" w16cid:durableId="209810429">
+    <w:abstractNumId w:val="2"/>
+  </w:num>
+  <w:num w:numId="2" w16cid:durableId="169419257">
+    <w:abstractNumId w:val="3"/>
+  </w:num>
+  <w:num w:numId="3" w16cid:durableId="681276379">
     <w:abstractNumId w:val="1"/>
   </w:num>
-  <w:num w:numId="2">
-    <w:abstractNumId w:val="2"/>
-  </w:num>
-  <w:num w:numId="3">
+  <w:num w:numId="4" w16cid:durableId="1262109917">
     <w:abstractNumId w:val="0"/>
   </w:num>
 </w:numbering>
 </file>
 
 <file path=word/styles.xml><?xml version="1.0" encoding="utf-8"?>
-<w:styles xmlns:mc="http://schemas.openxmlformats.org/markup-compatibility/2006" xmlns:r="http://schemas.openxmlformats.org/officeDocument/2006/relationships" xmlns:w="http://schemas.openxmlformats.org/wordprocessingml/2006/main" xmlns:w14="http://schemas.microsoft.com/office/word/2010/wordml" xmlns:w15="http://schemas.microsoft.com/office/word/2012/wordml" xmlns:w16cex="http://schemas.microsoft.com/office/word/2018/wordml/cex" xmlns:w16cid="http://schemas.microsoft.com/office/word/2016/wordml/cid" xmlns:w16="http://schemas.microsoft.com/office/word/2018/wordml" xmlns:w16sdtdh="http://schemas.microsoft.com/office/word/2020/wordml/sdtdatahash" xmlns:w16se="http://schemas.microsoft.com/office/word/2015/wordml/symex" mc:Ignorable="w14 w15 w16se w16cid w16 w16cex w16sdtdh">
+<w:styles xmlns:mc="http://schemas.openxmlformats.org/markup-compatibility/2006" xmlns:r="http://schemas.openxmlformats.org/officeDocument/2006/relationships" xmlns:w="http://schemas.openxmlformats.org/wordprocessingml/2006/main" xmlns:w14="http://schemas.microsoft.com/office/word/2010/wordml" xmlns:w15="http://schemas.microsoft.com/office/word/2012/wordml" xmlns:w16cex="http://schemas.microsoft.com/office/word/2018/wordml/cex" xmlns:w16cid="http://schemas.microsoft.com/office/word/2016/wordml/cid" xmlns:w16="http://schemas.microsoft.com/office/word/2018/wordml" xmlns:w16du="http://schemas.microsoft.com/office/word/2023/wordml/word16du" xmlns:w16sdtdh="http://schemas.microsoft.com/office/word/2020/wordml/sdtdatahash" xmlns:w16sdtfl="http://schemas.microsoft.com/office/word/2024/wordml/sdtformatlock" xmlns:w16se="http://schemas.microsoft.com/office/word/2015/wordml/symex" mc:Ignorable="w14 w15 w16se w16cid w16 w16cex w16sdtdh w16sdtfl w16du">
   <w:docDefaults>
     <w:rPrDefault>
       <w:rPr>

</xml_diff>